<commit_message>
Ficha e manuais: Prof. Rui César das Neves como professor orientador
</commit_message>
<xml_diff>
--- a/docs/Ficha_Validacao_RD_Clima.docx
+++ b/docs/Ficha_Validacao_RD_Clima.docx
@@ -11,7 +11,7 @@
           <w:noProof/>
         </w:rPr>
         <w:drawing>
-          <wp:inline distT="0" distB="0" distL="0" distR="0" wp14:anchorId="0F64530F" wp14:editId="16D30F10">
+          <wp:inline distT="0" distB="0" distL="0" distR="0" wp14:anchorId="37ECE30A" wp14:editId="15CED7D1">
             <wp:extent cx="609600" cy="571500"/>
             <wp:effectExtent l="0" t="0" r="0" b="0"/>
             <wp:docPr id="1" name="Imagem 1"/>
@@ -105,7 +105,7 @@
           <w:left w:w="10" w:type="dxa"/>
           <w:right w:w="10" w:type="dxa"/>
         </w:tblCellMar>
-        <w:tblLook w:val="04A0" w:firstRow="1" w:lastRow="0" w:firstColumn="1" w:lastColumn="0" w:noHBand="0" w:noVBand="1"/>
+        <w:tblLook w:val="0000" w:firstRow="0" w:lastRow="0" w:firstColumn="0" w:lastColumn="0" w:noHBand="0" w:noVBand="0"/>
       </w:tblPr>
       <w:tblGrid>
         <w:gridCol w:w="3000"/>
@@ -269,7 +269,7 @@
                 <w:b/>
                 <w:bCs/>
               </w:rPr>
-              <w:t>Coordenador / responsável</w:t>
+              <w:t>Professor orientador</w:t>
             </w:r>
           </w:p>
         </w:tc>
@@ -292,7 +292,7 @@
           </w:tcPr>
           <w:p>
             <w:r>
-              <w:t>Prof. Rui César das Neves</w:t>
+              <w:t>Prof. Rui César das Neves (acompanhamento e validação do projeto)</w:t>
             </w:r>
           </w:p>
         </w:tc>
@@ -523,7 +523,7 @@
           <w:left w:w="10" w:type="dxa"/>
           <w:right w:w="10" w:type="dxa"/>
         </w:tblCellMar>
-        <w:tblLook w:val="04A0" w:firstRow="1" w:lastRow="0" w:firstColumn="1" w:lastColumn="0" w:noHBand="0" w:noVBand="1"/>
+        <w:tblLook w:val="0000" w:firstRow="0" w:lastRow="0" w:firstColumn="0" w:lastColumn="0" w:noHBand="0" w:noVBand="0"/>
       </w:tblPr>
       <w:tblGrid>
         <w:gridCol w:w="3000"/>
@@ -963,7 +963,7 @@
         <w:spacing w:after="160"/>
       </w:pPr>
       <w:r>
-        <w:t>A preencher pelo coordenador. A classificação máxima (5) exige a entrega do Manual Técnico e do Manual de Utilizador.</w:t>
+        <w:t>A preencher pelo professor orientador, que acompanhou o projeto. A classificação máxima (5) exige a entrega do Manual Técnico e do Manual de Utilizador.</w:t>
       </w:r>
     </w:p>
     <w:tbl>
@@ -981,7 +981,7 @@
           <w:left w:w="10" w:type="dxa"/>
           <w:right w:w="10" w:type="dxa"/>
         </w:tblCellMar>
-        <w:tblLook w:val="04A0" w:firstRow="1" w:lastRow="0" w:firstColumn="1" w:lastColumn="0" w:noHBand="0" w:noVBand="1"/>
+        <w:tblLook w:val="0000" w:firstRow="0" w:lastRow="0" w:firstColumn="0" w:lastColumn="0" w:noHBand="0" w:noVBand="0"/>
       </w:tblPr>
       <w:tblGrid>
         <w:gridCol w:w="3000"/>
@@ -1207,7 +1207,7 @@
                 <w:b/>
                 <w:bCs/>
               </w:rPr>
-              <w:t>Assinatura do coordenador</w:t>
+              <w:t>Assinatura do professor orientador</w:t>
             </w:r>
           </w:p>
         </w:tc>
@@ -1246,10 +1246,10 @@
 <file path=word/numbering.xml><?xml version="1.0" encoding="utf-8"?>
 <w:numbering xmlns:wpc="http://schemas.microsoft.com/office/word/2010/wordprocessingCanvas" xmlns:cx="http://schemas.microsoft.com/office/drawing/2014/chartex" xmlns:cx1="http://schemas.microsoft.com/office/drawing/2015/9/8/chartex" xmlns:cx2="http://schemas.microsoft.com/office/drawing/2015/10/21/chartex" xmlns:cx3="http://schemas.microsoft.com/office/drawing/2016/5/9/chartex" xmlns:cx4="http://schemas.microsoft.com/office/drawing/2016/5/10/chartex" xmlns:cx5="http://schemas.microsoft.com/office/drawing/2016/5/11/chartex" xmlns:cx6="http://schemas.microsoft.com/office/drawing/2016/5/12/chartex" xmlns:cx7="http://schemas.microsoft.com/office/drawing/2016/5/13/chartex" xmlns:cx8="http://schemas.microsoft.com/office/drawing/2016/5/14/chartex" xmlns:mc="http://schemas.openxmlformats.org/markup-compatibility/2006" xmlns:aink="http://schemas.microsoft.com/office/drawing/2016/ink" xmlns:am3d="http://schemas.microsoft.com/office/drawing/2017/model3d" xmlns:o="urn:schemas-microsoft-com:office:office" xmlns:oel="http://schemas.microsoft.com/office/2019/extlst" xmlns:r="http://schemas.openxmlformats.org/officeDocument/2006/relationships" xmlns:m="http://schemas.openxmlformats.org/officeDocument/2006/math" xmlns:v="urn:schemas-microsoft-com:vml" xmlns:wp14="http://schemas.microsoft.com/office/word/2010/wordprocessingDrawing" xmlns:wp="http://schemas.openxmlformats.org/drawingml/2006/wordprocessingDrawing" xmlns:w10="urn:schemas-microsoft-com:office:word" xmlns:w="http://schemas.openxmlformats.org/wordprocessingml/2006/main" xmlns:w14="http://schemas.microsoft.com/office/word/2010/wordml" xmlns:w15="http://schemas.microsoft.com/office/word/2012/wordml" xmlns:w16cex="http://schemas.microsoft.com/office/word/2018/wordml/cex" xmlns:w16cid="http://schemas.microsoft.com/office/word/2016/wordml/cid" xmlns:w16="http://schemas.microsoft.com/office/word/2018/wordml" xmlns:w16du="http://schemas.microsoft.com/office/word/2023/wordml/word16du" xmlns:w16sdtdh="http://schemas.microsoft.com/office/word/2020/wordml/sdtdatahash" xmlns:w16sdtfl="http://schemas.microsoft.com/office/word/2024/wordml/sdtformatlock" xmlns:w16se="http://schemas.microsoft.com/office/word/2015/wordml/symex" xmlns:wpg="http://schemas.microsoft.com/office/word/2010/wordprocessingGroup" xmlns:wpi="http://schemas.microsoft.com/office/word/2010/wordprocessingInk" xmlns:wne="http://schemas.microsoft.com/office/word/2006/wordml" xmlns:wps="http://schemas.microsoft.com/office/word/2010/wordprocessingShape" mc:Ignorable="w14 w15 w16se w16cid w16 w16cex w16sdtdh w16sdtfl w16du wp14">
   <w:abstractNum w:abstractNumId="0" w15:restartNumberingAfterBreak="0">
-    <w:nsid w:val="02564960"/>
+    <w:nsid w:val="37B84998"/>
     <w:multiLevelType w:val="hybridMultilevel"/>
-    <w:tmpl w:val="44B0872A"/>
-    <w:lvl w:ilvl="0" w:tplc="BE0426C0">
+    <w:tmpl w:val="36A6E196"/>
+    <w:lvl w:ilvl="0" w:tplc="F286ACF4">
       <w:start w:val="1"/>
       <w:numFmt w:val="bullet"/>
       <w:lvlText w:val="●"/>
@@ -1258,7 +1258,7 @@
         <w:ind w:left="720" w:hanging="360"/>
       </w:pPr>
     </w:lvl>
-    <w:lvl w:ilvl="1" w:tplc="023E66BC">
+    <w:lvl w:ilvl="1" w:tplc="BD702200">
       <w:start w:val="1"/>
       <w:numFmt w:val="bullet"/>
       <w:lvlText w:val="○"/>
@@ -1267,7 +1267,7 @@
         <w:ind w:left="1440" w:hanging="360"/>
       </w:pPr>
     </w:lvl>
-    <w:lvl w:ilvl="2" w:tplc="97A058C6">
+    <w:lvl w:ilvl="2" w:tplc="BEAE97D4">
       <w:start w:val="1"/>
       <w:numFmt w:val="bullet"/>
       <w:lvlText w:val="■"/>
@@ -1276,7 +1276,7 @@
         <w:ind w:left="2160" w:hanging="360"/>
       </w:pPr>
     </w:lvl>
-    <w:lvl w:ilvl="3" w:tplc="057006FC">
+    <w:lvl w:ilvl="3" w:tplc="1722C348">
       <w:start w:val="1"/>
       <w:numFmt w:val="bullet"/>
       <w:lvlText w:val="●"/>
@@ -1285,7 +1285,7 @@
         <w:ind w:left="2880" w:hanging="360"/>
       </w:pPr>
     </w:lvl>
-    <w:lvl w:ilvl="4" w:tplc="6A18ADBC">
+    <w:lvl w:ilvl="4" w:tplc="3AE4B498">
       <w:start w:val="1"/>
       <w:numFmt w:val="bullet"/>
       <w:lvlText w:val="○"/>
@@ -1294,7 +1294,7 @@
         <w:ind w:left="3600" w:hanging="360"/>
       </w:pPr>
     </w:lvl>
-    <w:lvl w:ilvl="5" w:tplc="803C05CE">
+    <w:lvl w:ilvl="5" w:tplc="C28CE918">
       <w:start w:val="1"/>
       <w:numFmt w:val="bullet"/>
       <w:lvlText w:val="■"/>
@@ -1303,7 +1303,7 @@
         <w:ind w:left="4320" w:hanging="360"/>
       </w:pPr>
     </w:lvl>
-    <w:lvl w:ilvl="6" w:tplc="1CA2B630">
+    <w:lvl w:ilvl="6" w:tplc="F67CBF54">
       <w:start w:val="1"/>
       <w:numFmt w:val="bullet"/>
       <w:lvlText w:val="●"/>
@@ -1312,7 +1312,7 @@
         <w:ind w:left="5040" w:hanging="360"/>
       </w:pPr>
     </w:lvl>
-    <w:lvl w:ilvl="7" w:tplc="C86C6C3C">
+    <w:lvl w:ilvl="7" w:tplc="8CAC48BA">
       <w:start w:val="1"/>
       <w:numFmt w:val="bullet"/>
       <w:lvlText w:val="●"/>
@@ -1321,7 +1321,7 @@
         <w:ind w:left="5760" w:hanging="360"/>
       </w:pPr>
     </w:lvl>
-    <w:lvl w:ilvl="8" w:tplc="B1A6C0E4">
+    <w:lvl w:ilvl="8" w:tplc="8B26A4E6">
       <w:start w:val="1"/>
       <w:numFmt w:val="bullet"/>
       <w:lvlText w:val="●"/>
@@ -1332,10 +1332,10 @@
     </w:lvl>
   </w:abstractNum>
   <w:abstractNum w:abstractNumId="1" w15:restartNumberingAfterBreak="0">
-    <w:nsid w:val="4ADC1143"/>
+    <w:nsid w:val="637C52BB"/>
     <w:multiLevelType w:val="hybridMultilevel"/>
-    <w:tmpl w:val="C208467C"/>
-    <w:lvl w:ilvl="0" w:tplc="7C2AC76C">
+    <w:tmpl w:val="45869DCE"/>
+    <w:lvl w:ilvl="0" w:tplc="624092AA">
       <w:start w:val="1"/>
       <w:numFmt w:val="bullet"/>
       <w:lvlText w:val="•"/>
@@ -1344,54 +1344,54 @@
         <w:ind w:left="540" w:hanging="360"/>
       </w:pPr>
     </w:lvl>
-    <w:lvl w:ilvl="1" w:tplc="04407186">
+    <w:lvl w:ilvl="1" w:tplc="2FA65CD0">
       <w:numFmt w:val="decimal"/>
       <w:lvlText w:val=""/>
       <w:lvlJc w:val="left"/>
     </w:lvl>
-    <w:lvl w:ilvl="2" w:tplc="906E568E">
+    <w:lvl w:ilvl="2" w:tplc="EA6E1724">
       <w:numFmt w:val="decimal"/>
       <w:lvlText w:val=""/>
       <w:lvlJc w:val="left"/>
     </w:lvl>
-    <w:lvl w:ilvl="3" w:tplc="E0E2FB58">
+    <w:lvl w:ilvl="3" w:tplc="31329B36">
       <w:numFmt w:val="decimal"/>
       <w:lvlText w:val=""/>
       <w:lvlJc w:val="left"/>
     </w:lvl>
-    <w:lvl w:ilvl="4" w:tplc="23B0745C">
+    <w:lvl w:ilvl="4" w:tplc="DEBA3FD0">
       <w:numFmt w:val="decimal"/>
       <w:lvlText w:val=""/>
       <w:lvlJc w:val="left"/>
     </w:lvl>
-    <w:lvl w:ilvl="5" w:tplc="7E5CF63C">
+    <w:lvl w:ilvl="5" w:tplc="67A21EEA">
       <w:numFmt w:val="decimal"/>
       <w:lvlText w:val=""/>
       <w:lvlJc w:val="left"/>
     </w:lvl>
-    <w:lvl w:ilvl="6" w:tplc="DE305F4E">
+    <w:lvl w:ilvl="6" w:tplc="45C4E424">
       <w:numFmt w:val="decimal"/>
       <w:lvlText w:val=""/>
       <w:lvlJc w:val="left"/>
     </w:lvl>
-    <w:lvl w:ilvl="7" w:tplc="A7201C9C">
+    <w:lvl w:ilvl="7" w:tplc="CD943220">
       <w:numFmt w:val="decimal"/>
       <w:lvlText w:val=""/>
       <w:lvlJc w:val="left"/>
     </w:lvl>
-    <w:lvl w:ilvl="8" w:tplc="F3A21CEC">
+    <w:lvl w:ilvl="8" w:tplc="519C281E">
       <w:numFmt w:val="decimal"/>
       <w:lvlText w:val=""/>
       <w:lvlJc w:val="left"/>
     </w:lvl>
   </w:abstractNum>
-  <w:num w:numId="1" w16cid:durableId="857354804">
+  <w:num w:numId="1" w16cid:durableId="888685931">
     <w:abstractNumId w:val="0"/>
     <w:lvlOverride w:ilvl="0">
       <w:startOverride w:val="1"/>
     </w:lvlOverride>
   </w:num>
-  <w:num w:numId="2" w16cid:durableId="1340473483">
+  <w:num w:numId="2" w16cid:durableId="1777169159">
     <w:abstractNumId w:val="1"/>
     <w:lvlOverride w:ilvl="0">
       <w:startOverride w:val="1"/>

</xml_diff>

<commit_message>
Ficha: link do repositório e dos manuais no GitHub
</commit_message>
<xml_diff>
--- a/docs/Ficha_Validacao_RD_Clima.docx
+++ b/docs/Ficha_Validacao_RD_Clima.docx
@@ -433,9 +433,15 @@
             <w:vAlign w:val="center"/>
           </w:tcPr>
           <w:p>
-            <w:r>
-              <w:t xml:space="preserve">https://github.com/</w:t>
-            </w:r>
+            <w:hyperlink w:history="1" r:id="rId5ha2ismlvxxie2nwzzmdu">
+              <w:r>
+                <w:rPr>
+                  <w:color w:val="0563C1"/>
+                  <w:u w:val="single"/>
+                </w:rPr>
+                <w:t xml:space="preserve">https://github.com/FilipeDordio/rd-clima</w:t>
+              </w:r>
+            </w:hyperlink>
           </w:p>
         </w:tc>
       </w:tr>
@@ -814,7 +820,7 @@
         </w:numPr>
         <w:spacing w:after="80"/>
       </w:pPr>
-      <w:hyperlink w:history="1" r:id="rId98s1xreebntobaiarjj-m">
+      <w:hyperlink w:history="1" r:id="rId6pz1-byt62tr2gcu1idbz">
         <w:r>
           <w:rPr>
             <w:b/>
@@ -838,7 +844,7 @@
         </w:numPr>
         <w:spacing w:after="80"/>
       </w:pPr>
-      <w:hyperlink w:history="1" r:id="rIdby8l71ob5ewhkks4ru3f5">
+      <w:hyperlink w:history="1" r:id="rIdemije2ybwbyhkktez7kdw">
         <w:r>
           <w:rPr>
             <w:b/>

</xml_diff>

<commit_message>
Ficha: logótipo da UniPS, tabelas a azul e link do repositório na documentação entregue
</commit_message>
<xml_diff>
--- a/docs/Ficha_Validacao_RD_Clima.docx
+++ b/docs/Ficha_Validacao_RD_Clima.docx
@@ -9,7 +9,7 @@
       <w:r>
         <w:drawing>
           <wp:inline distT="0" distB="0" distL="0" distR="0">
-            <wp:extent cx="609600" cy="571500"/>
+            <wp:extent cx="1619250" cy="619125"/>
             <wp:effectExtent t="0" r="0" b="0" l="0"/>
             <wp:docPr id="1" name="" descr="" title=""/>
             <wp:cNvGraphicFramePr>
@@ -34,7 +34,7 @@
                   <pic:spPr bwMode="auto">
                     <a:xfrm>
                       <a:off x="0" y="0"/>
-                      <a:ext cx="609600" cy="571500"/>
+                      <a:ext cx="1619250" cy="619125"/>
                     </a:xfrm>
                     <a:prstGeom prst="rect">
                       <a:avLst/>
@@ -116,7 +116,7 @@
               <w:bottom w:val="single" w:color="BFB8AC" w:sz="4"/>
               <w:right w:val="single" w:color="BFB8AC" w:sz="4"/>
             </w:tcBorders>
-            <w:shd w:fill="F7F3EA" w:color="auto" w:val="clear"/>
+            <w:shd w:fill="EAF1F9" w:color="auto" w:val="clear"/>
             <w:tcMar>
               <w:top w:type="dxa" w:w="60"/>
               <w:left w:type="dxa" w:w="120"/>
@@ -172,7 +172,7 @@
               <w:bottom w:val="single" w:color="BFB8AC" w:sz="4"/>
               <w:right w:val="single" w:color="BFB8AC" w:sz="4"/>
             </w:tcBorders>
-            <w:shd w:fill="F7F3EA" w:color="auto" w:val="clear"/>
+            <w:shd w:fill="EAF1F9" w:color="auto" w:val="clear"/>
             <w:tcMar>
               <w:top w:type="dxa" w:w="60"/>
               <w:left w:type="dxa" w:w="120"/>
@@ -228,7 +228,7 @@
               <w:bottom w:val="single" w:color="BFB8AC" w:sz="4"/>
               <w:right w:val="single" w:color="BFB8AC" w:sz="4"/>
             </w:tcBorders>
-            <w:shd w:fill="F7F3EA" w:color="auto" w:val="clear"/>
+            <w:shd w:fill="EAF1F9" w:color="auto" w:val="clear"/>
             <w:tcMar>
               <w:top w:type="dxa" w:w="60"/>
               <w:left w:type="dxa" w:w="120"/>
@@ -284,7 +284,7 @@
               <w:bottom w:val="single" w:color="BFB8AC" w:sz="4"/>
               <w:right w:val="single" w:color="BFB8AC" w:sz="4"/>
             </w:tcBorders>
-            <w:shd w:fill="F7F3EA" w:color="auto" w:val="clear"/>
+            <w:shd w:fill="EAF1F9" w:color="auto" w:val="clear"/>
             <w:tcMar>
               <w:top w:type="dxa" w:w="60"/>
               <w:left w:type="dxa" w:w="120"/>
@@ -340,7 +340,7 @@
               <w:bottom w:val="single" w:color="BFB8AC" w:sz="4"/>
               <w:right w:val="single" w:color="BFB8AC" w:sz="4"/>
             </w:tcBorders>
-            <w:shd w:fill="F7F3EA" w:color="auto" w:val="clear"/>
+            <w:shd w:fill="EAF1F9" w:color="auto" w:val="clear"/>
             <w:tcMar>
               <w:top w:type="dxa" w:w="60"/>
               <w:left w:type="dxa" w:w="120"/>
@@ -380,68 +380,6 @@
             <w:r>
               <w:t xml:space="preserve">170 horas (referência: 6 ECTS × 27 h = 162 h)</w:t>
             </w:r>
-          </w:p>
-        </w:tc>
-      </w:tr>
-      <w:tr>
-        <w:trPr>
-          <w:cantSplit/>
-        </w:trPr>
-        <w:tc>
-          <w:tcPr>
-            <w:tcW w:type="dxa" w:w="3000"/>
-            <w:tcBorders>
-              <w:top w:val="single" w:color="BFB8AC" w:sz="4"/>
-              <w:left w:val="single" w:color="BFB8AC" w:sz="4"/>
-              <w:bottom w:val="single" w:color="BFB8AC" w:sz="4"/>
-              <w:right w:val="single" w:color="BFB8AC" w:sz="4"/>
-            </w:tcBorders>
-            <w:shd w:fill="F7F3EA" w:color="auto" w:val="clear"/>
-            <w:tcMar>
-              <w:top w:type="dxa" w:w="60"/>
-              <w:left w:type="dxa" w:w="120"/>
-              <w:bottom w:type="dxa" w:w="60"/>
-              <w:right w:type="dxa" w:w="120"/>
-            </w:tcMar>
-            <w:vAlign w:val="center"/>
-          </w:tcPr>
-          <w:p>
-            <w:r>
-              <w:rPr>
-                <w:b/>
-                <w:bCs/>
-              </w:rPr>
-              <w:t xml:space="preserve">Repositório GitHub</w:t>
-            </w:r>
-          </w:p>
-        </w:tc>
-        <w:tc>
-          <w:tcPr>
-            <w:tcW w:type="dxa" w:w="6638"/>
-            <w:tcBorders>
-              <w:top w:val="single" w:color="BFB8AC" w:sz="4"/>
-              <w:left w:val="single" w:color="BFB8AC" w:sz="4"/>
-              <w:bottom w:val="single" w:color="BFB8AC" w:sz="4"/>
-              <w:right w:val="single" w:color="BFB8AC" w:sz="4"/>
-            </w:tcBorders>
-            <w:tcMar>
-              <w:top w:type="dxa" w:w="60"/>
-              <w:left w:type="dxa" w:w="120"/>
-              <w:bottom w:type="dxa" w:w="60"/>
-              <w:right w:type="dxa" w:w="120"/>
-            </w:tcMar>
-            <w:vAlign w:val="center"/>
-          </w:tcPr>
-          <w:p>
-            <w:hyperlink w:history="1" r:id="rId5ha2ismlvxxie2nwzzmdu">
-              <w:r>
-                <w:rPr>
-                  <w:color w:val="0563C1"/>
-                  <w:u w:val="single"/>
-                </w:rPr>
-                <w:t xml:space="preserve">https://github.com/FilipeDordio/rd-clima</w:t>
-              </w:r>
-            </w:hyperlink>
           </w:p>
         </w:tc>
       </w:tr>
@@ -499,7 +437,7 @@
               <w:bottom w:val="single" w:color="BFB8AC" w:sz="4"/>
               <w:right w:val="single" w:color="BFB8AC" w:sz="4"/>
             </w:tcBorders>
-            <w:shd w:fill="EFE6D2" w:color="auto" w:val="clear"/>
+            <w:shd w:fill="D6E4F2" w:color="auto" w:val="clear"/>
             <w:tcMar>
               <w:top w:type="dxa" w:w="60"/>
               <w:left w:type="dxa" w:w="120"/>
@@ -527,7 +465,7 @@
               <w:bottom w:val="single" w:color="BFB8AC" w:sz="4"/>
               <w:right w:val="single" w:color="BFB8AC" w:sz="4"/>
             </w:tcBorders>
-            <w:shd w:fill="EFE6D2" w:color="auto" w:val="clear"/>
+            <w:shd w:fill="D6E4F2" w:color="auto" w:val="clear"/>
             <w:tcMar>
               <w:top w:type="dxa" w:w="60"/>
               <w:left w:type="dxa" w:w="120"/>
@@ -820,7 +758,7 @@
         </w:numPr>
         <w:spacing w:after="80"/>
       </w:pPr>
-      <w:hyperlink w:history="1" r:id="rId6pz1-byt62tr2gcu1idbz">
+      <w:hyperlink w:history="1" r:id="rIdntz9exgczfonwvy4jldkb">
         <w:r>
           <w:rPr>
             <w:b/>
@@ -844,7 +782,7 @@
         </w:numPr>
         <w:spacing w:after="80"/>
       </w:pPr>
-      <w:hyperlink w:history="1" r:id="rIdemije2ybwbyhkktez7kdw">
+      <w:hyperlink w:history="1" r:id="rIdc_dxqusugsayny9wlw81_">
         <w:r>
           <w:rPr>
             <w:b/>
@@ -868,15 +806,19 @@
         </w:numPr>
         <w:spacing w:after="80"/>
       </w:pPr>
-      <w:r>
-        <w:rPr>
-          <w:b/>
-          <w:bCs/>
-        </w:rPr>
-        <w:t xml:space="preserve">Código-fonte</w:t>
-      </w:r>
-      <w:r>
-        <w:t xml:space="preserve"> — repositório GitHub indicado acima</w:t>
+      <w:hyperlink w:history="1" r:id="rIdt5gthvzjvclnj9isybmoz">
+        <w:r>
+          <w:rPr>
+            <w:b/>
+            <w:bCs/>
+            <w:color w:val="0563C1"/>
+            <w:u w:val="single"/>
+          </w:rPr>
+          <w:t xml:space="preserve">Código-fonte</w:t>
+        </w:r>
+      </w:hyperlink>
+      <w:r>
+        <w:t xml:space="preserve"> — repositório GitHub: https://github.com/FilipeDordio/rd-clima</w:t>
       </w:r>
     </w:p>
     <w:p>
@@ -925,7 +867,7 @@
               <w:bottom w:val="single" w:color="BFB8AC" w:sz="4"/>
               <w:right w:val="single" w:color="BFB8AC" w:sz="4"/>
             </w:tcBorders>
-            <w:shd w:fill="F7F3EA" w:color="auto" w:val="clear"/>
+            <w:shd w:fill="EAF1F9" w:color="auto" w:val="clear"/>
             <w:tcMar>
               <w:top w:type="dxa" w:w="60"/>
               <w:left w:type="dxa" w:w="120"/>
@@ -982,7 +924,7 @@
               <w:bottom w:val="single" w:color="BFB8AC" w:sz="4"/>
               <w:right w:val="single" w:color="BFB8AC" w:sz="4"/>
             </w:tcBorders>
-            <w:shd w:fill="F7F3EA" w:color="auto" w:val="clear"/>
+            <w:shd w:fill="EAF1F9" w:color="auto" w:val="clear"/>
             <w:tcMar>
               <w:top w:type="dxa" w:w="60"/>
               <w:left w:type="dxa" w:w="120"/>
@@ -1035,7 +977,7 @@
               <w:bottom w:val="single" w:color="BFB8AC" w:sz="4"/>
               <w:right w:val="single" w:color="BFB8AC" w:sz="4"/>
             </w:tcBorders>
-            <w:shd w:fill="F7F3EA" w:color="auto" w:val="clear"/>
+            <w:shd w:fill="EAF1F9" w:color="auto" w:val="clear"/>
             <w:tcMar>
               <w:top w:type="dxa" w:w="60"/>
               <w:left w:type="dxa" w:w="120"/>
@@ -1092,7 +1034,7 @@
               <w:bottom w:val="single" w:color="BFB8AC" w:sz="4"/>
               <w:right w:val="single" w:color="BFB8AC" w:sz="4"/>
             </w:tcBorders>
-            <w:shd w:fill="F7F3EA" w:color="auto" w:val="clear"/>
+            <w:shd w:fill="EAF1F9" w:color="auto" w:val="clear"/>
             <w:tcMar>
               <w:top w:type="dxa" w:w="60"/>
               <w:left w:type="dxa" w:w="120"/>

</xml_diff>

<commit_message>
Ficha: remove a linha de créditos
</commit_message>
<xml_diff>
--- a/docs/Ficha_Validacao_RD_Clima.docx
+++ b/docs/Ficha_Validacao_RD_Clima.docx
@@ -299,62 +299,6 @@
                 <w:b/>
                 <w:bCs/>
               </w:rPr>
-              <w:t xml:space="preserve">Créditos</w:t>
-            </w:r>
-          </w:p>
-        </w:tc>
-        <w:tc>
-          <w:tcPr>
-            <w:tcW w:type="dxa" w:w="6638"/>
-            <w:tcBorders>
-              <w:top w:val="single" w:color="BFB8AC" w:sz="4"/>
-              <w:left w:val="single" w:color="BFB8AC" w:sz="4"/>
-              <w:bottom w:val="single" w:color="BFB8AC" w:sz="4"/>
-              <w:right w:val="single" w:color="BFB8AC" w:sz="4"/>
-            </w:tcBorders>
-            <w:tcMar>
-              <w:top w:type="dxa" w:w="60"/>
-              <w:left w:type="dxa" w:w="120"/>
-              <w:bottom w:type="dxa" w:w="60"/>
-              <w:right w:type="dxa" w:w="120"/>
-            </w:tcMar>
-            <w:vAlign w:val="center"/>
-          </w:tcPr>
-          <w:p>
-            <w:r>
-              <w:t xml:space="preserve">6 ECTS</w:t>
-            </w:r>
-          </w:p>
-        </w:tc>
-      </w:tr>
-      <w:tr>
-        <w:trPr>
-          <w:cantSplit/>
-        </w:trPr>
-        <w:tc>
-          <w:tcPr>
-            <w:tcW w:type="dxa" w:w="3000"/>
-            <w:tcBorders>
-              <w:top w:val="single" w:color="BFB8AC" w:sz="4"/>
-              <w:left w:val="single" w:color="BFB8AC" w:sz="4"/>
-              <w:bottom w:val="single" w:color="BFB8AC" w:sz="4"/>
-              <w:right w:val="single" w:color="BFB8AC" w:sz="4"/>
-            </w:tcBorders>
-            <w:shd w:fill="EAF1F9" w:color="auto" w:val="clear"/>
-            <w:tcMar>
-              <w:top w:type="dxa" w:w="60"/>
-              <w:left w:type="dxa" w:w="120"/>
-              <w:bottom w:type="dxa" w:w="60"/>
-              <w:right w:type="dxa" w:w="120"/>
-            </w:tcMar>
-            <w:vAlign w:val="center"/>
-          </w:tcPr>
-          <w:p>
-            <w:r>
-              <w:rPr>
-                <w:b/>
-                <w:bCs/>
-              </w:rPr>
               <w:t xml:space="preserve">Horas dedicadas</w:t>
             </w:r>
           </w:p>
@@ -758,7 +702,7 @@
         </w:numPr>
         <w:spacing w:after="80"/>
       </w:pPr>
-      <w:hyperlink w:history="1" r:id="rIdntz9exgczfonwvy4jldkb">
+      <w:hyperlink w:history="1" r:id="rIdrivgrbjeddnhxap-cdtvg">
         <w:r>
           <w:rPr>
             <w:b/>
@@ -782,7 +726,7 @@
         </w:numPr>
         <w:spacing w:after="80"/>
       </w:pPr>
-      <w:hyperlink w:history="1" r:id="rIdc_dxqusugsayny9wlw81_">
+      <w:hyperlink w:history="1" r:id="rIdkf4ymtnh_xhhuu0ucqbjs">
         <w:r>
           <w:rPr>
             <w:b/>
@@ -806,7 +750,7 @@
         </w:numPr>
         <w:spacing w:after="80"/>
       </w:pPr>
-      <w:hyperlink w:history="1" r:id="rIdt5gthvzjvclnj9isybmoz">
+      <w:hyperlink w:history="1" r:id="rIdbvylzvthcnq37hucgcvtb">
         <w:r>
           <w:rPr>
             <w:b/>

</xml_diff>